<commit_message>
fix: align payout document typography and PDF layout
</commit_message>
<xml_diff>
--- a/static/templat/invois.docx
+++ b/static/templat/invois.docx
@@ -6,58 +6,76 @@
       <w:pPr>
         <w:ind w:left="270"/>
         <w:rPr>
-          <w:rFonts w:ascii="Times New Roman" w:hAnsi="Times New Roman" w:cs="Times New Roman"/>
-          <w:b/>
-          <w:bCs/>
-        </w:rPr>
+          <w:rFonts w:ascii="Times New Roman" w:hAnsi="Times New Roman" w:eastAsia="Times New Roman" w:cs="Times New Roman"/>
+          <w:b/>
+          <w:bCs/>
+          <w:sz w:val="22"/>
+          <w:szCs w:val="22"/>
+        </w:rPr>
+        <w:spacing w:before="0" w:after="100" w:line="240" w:lineRule="auto"/>
       </w:pPr>
     </w:p>
     <w:p>
       <w:pPr>
         <w:ind w:left="270"/>
         <w:rPr>
-          <w:rFonts w:ascii="Times New Roman" w:hAnsi="Times New Roman" w:cs="Times New Roman"/>
-          <w:b/>
-          <w:bCs/>
-        </w:rPr>
+          <w:rFonts w:ascii="Times New Roman" w:hAnsi="Times New Roman" w:eastAsia="Times New Roman" w:cs="Times New Roman"/>
+          <w:b/>
+          <w:bCs/>
+          <w:sz w:val="22"/>
+          <w:szCs w:val="22"/>
+        </w:rPr>
+        <w:spacing w:before="0" w:after="100" w:line="240" w:lineRule="auto"/>
       </w:pPr>
     </w:p>
     <w:p>
       <w:pPr>
         <w:ind w:left="270"/>
         <w:rPr>
-          <w:rFonts w:ascii="Times New Roman" w:hAnsi="Times New Roman" w:cs="Times New Roman"/>
-          <w:b/>
-          <w:bCs/>
-        </w:rPr>
+          <w:rFonts w:ascii="Times New Roman" w:hAnsi="Times New Roman" w:eastAsia="Times New Roman" w:cs="Times New Roman"/>
+          <w:b/>
+          <w:bCs/>
+          <w:sz w:val="22"/>
+          <w:szCs w:val="22"/>
+        </w:rPr>
+        <w:spacing w:before="0" w:after="100" w:line="240" w:lineRule="auto"/>
       </w:pPr>
     </w:p>
     <w:p>
       <w:pPr>
         <w:ind w:left="270"/>
         <w:rPr>
-          <w:rFonts w:ascii="Times New Roman" w:hAnsi="Times New Roman" w:cs="Times New Roman"/>
-        </w:rPr>
-      </w:pPr>
-      <w:r>
-        <w:rPr>
-          <w:rFonts w:ascii="Times New Roman" w:hAnsi="Times New Roman" w:cs="Times New Roman"/>
-          <w:b/>
-          <w:bCs/>
+          <w:rFonts w:ascii="Times New Roman" w:hAnsi="Times New Roman" w:eastAsia="Times New Roman" w:cs="Times New Roman"/>
+          <w:sz w:val="22"/>
+          <w:szCs w:val="22"/>
+        </w:rPr>
+        <w:spacing w:before="0" w:after="100" w:line="240" w:lineRule="auto"/>
+      </w:pPr>
+      <w:r>
+        <w:rPr>
+          <w:rFonts w:ascii="Times New Roman" w:hAnsi="Times New Roman" w:eastAsia="Times New Roman" w:cs="Times New Roman"/>
+          <w:b/>
+          <w:bCs/>
+          <w:sz w:val="22"/>
+          <w:szCs w:val="22"/>
         </w:rPr>
         <w:t>Alamat</w:t>
       </w:r>
       <w:r>
         <w:rPr>
-          <w:rFonts w:ascii="Times New Roman" w:hAnsi="Times New Roman" w:cs="Times New Roman"/>
-          <w:b/>
-          <w:bCs/>
+          <w:rFonts w:ascii="Times New Roman" w:hAnsi="Times New Roman" w:eastAsia="Times New Roman" w:cs="Times New Roman"/>
+          <w:b/>
+          <w:bCs/>
+          <w:sz w:val="22"/>
+          <w:szCs w:val="22"/>
         </w:rPr>
         <w:t xml:space="preserve"> </w:t>
       </w:r>
       <w:r>
         <w:rPr>
-          <w:rFonts w:ascii="Times New Roman" w:hAnsi="Times New Roman" w:cs="Times New Roman"/>
+          <w:rFonts w:ascii="Times New Roman" w:hAnsi="Times New Roman" w:eastAsia="Times New Roman" w:cs="Times New Roman"/>
+          <w:sz w:val="22"/>
+          <w:szCs w:val="22"/>
         </w:rPr>
         <w:t xml:space="preserve"> </w:t>
       </w:r>
@@ -69,13 +87,17 @@
       </w:r>
       <w:r>
         <w:rPr>
-          <w:rFonts w:ascii="Times New Roman" w:hAnsi="Times New Roman" w:cs="Times New Roman"/>
+          <w:rFonts w:ascii="Times New Roman" w:hAnsi="Times New Roman" w:eastAsia="Times New Roman" w:cs="Times New Roman"/>
+          <w:sz w:val="22"/>
+          <w:szCs w:val="22"/>
         </w:rPr>
         <w:t xml:space="preserve">: </w:t>
       </w:r>
       <w:r>
         <w:rPr>
-          <w:rFonts w:ascii="Times New Roman" w:hAnsi="Times New Roman" w:cs="Times New Roman"/>
+          <w:rFonts w:ascii="Times New Roman" w:hAnsi="Times New Roman" w:eastAsia="Times New Roman" w:cs="Times New Roman"/>
+          <w:sz w:val="22"/>
+          <w:szCs w:val="22"/>
         </w:rPr>
         <w:t xml:space="preserve">{alamatPerguruanTinggi}</w:t>
       </w:r>
@@ -86,14 +108,19 @@
       <w:pPr>
         <w:ind w:left="270"/>
         <w:rPr>
-          <w:rFonts w:ascii="Times New Roman" w:hAnsi="Times New Roman" w:cs="Times New Roman"/>
-        </w:rPr>
-      </w:pPr>
-      <w:r>
-        <w:rPr>
-          <w:rFonts w:ascii="Times New Roman" w:hAnsi="Times New Roman" w:cs="Times New Roman"/>
-          <w:b/>
-          <w:bCs/>
+          <w:rFonts w:ascii="Times New Roman" w:hAnsi="Times New Roman" w:eastAsia="Times New Roman" w:cs="Times New Roman"/>
+          <w:sz w:val="22"/>
+          <w:szCs w:val="22"/>
+        </w:rPr>
+        <w:spacing w:before="0" w:after="100" w:line="240" w:lineRule="auto"/>
+      </w:pPr>
+      <w:r>
+        <w:rPr>
+          <w:rFonts w:ascii="Times New Roman" w:hAnsi="Times New Roman" w:eastAsia="Times New Roman" w:cs="Times New Roman"/>
+          <w:b/>
+          <w:bCs/>
+          <w:sz w:val="22"/>
+          <w:szCs w:val="22"/>
         </w:rPr>
         <w:t>Tahun Anggaran</w:t>
       </w:r>
@@ -102,13 +129,17 @@
       </w:r>
       <w:r>
         <w:rPr>
-          <w:rFonts w:ascii="Times New Roman" w:hAnsi="Times New Roman" w:cs="Times New Roman"/>
+          <w:rFonts w:ascii="Times New Roman" w:hAnsi="Times New Roman" w:eastAsia="Times New Roman" w:cs="Times New Roman"/>
+          <w:sz w:val="22"/>
+          <w:szCs w:val="22"/>
         </w:rPr>
         <w:t>: 202</w:t>
       </w:r>
       <w:r>
         <w:rPr>
-          <w:rFonts w:ascii="Times New Roman" w:hAnsi="Times New Roman" w:cs="Times New Roman"/>
+          <w:rFonts w:ascii="Times New Roman" w:hAnsi="Times New Roman" w:eastAsia="Times New Roman" w:cs="Times New Roman"/>
+          <w:sz w:val="22"/>
+          <w:szCs w:val="22"/>
         </w:rPr>
         <w:t>5</w:t>
       </w:r>
@@ -117,32 +148,41 @@
       <w:pPr>
         <w:ind w:left="270"/>
         <w:rPr>
-          <w:rFonts w:ascii="Times New Roman" w:hAnsi="Times New Roman" w:cs="Times New Roman"/>
-        </w:rPr>
+          <w:rFonts w:ascii="Times New Roman" w:hAnsi="Times New Roman" w:eastAsia="Times New Roman" w:cs="Times New Roman"/>
+          <w:sz w:val="22"/>
+          <w:szCs w:val="22"/>
+        </w:rPr>
+        <w:spacing w:before="0" w:after="100" w:line="240" w:lineRule="auto"/>
       </w:pPr>
       <w:proofErr w:type="spellStart"/>
       <w:r>
         <w:rPr>
-          <w:rFonts w:ascii="Times New Roman" w:hAnsi="Times New Roman" w:cs="Times New Roman"/>
-          <w:b/>
-          <w:bCs/>
+          <w:rFonts w:ascii="Times New Roman" w:hAnsi="Times New Roman" w:eastAsia="Times New Roman" w:cs="Times New Roman"/>
+          <w:b/>
+          <w:bCs/>
+          <w:sz w:val="22"/>
+          <w:szCs w:val="22"/>
         </w:rPr>
         <w:t>Nomor</w:t>
       </w:r>
       <w:proofErr w:type="spellEnd"/>
       <w:r>
         <w:rPr>
-          <w:rFonts w:ascii="Times New Roman" w:hAnsi="Times New Roman" w:cs="Times New Roman"/>
-          <w:b/>
-          <w:bCs/>
+          <w:rFonts w:ascii="Times New Roman" w:hAnsi="Times New Roman" w:eastAsia="Times New Roman" w:cs="Times New Roman"/>
+          <w:b/>
+          <w:bCs/>
+          <w:sz w:val="22"/>
+          <w:szCs w:val="22"/>
         </w:rPr>
         <w:t xml:space="preserve"> </w:t>
       </w:r>
       <w:r>
         <w:rPr>
-          <w:rFonts w:ascii="Times New Roman" w:hAnsi="Times New Roman" w:cs="Times New Roman"/>
-          <w:b/>
-          <w:bCs/>
+          <w:rFonts w:ascii="Times New Roman" w:hAnsi="Times New Roman" w:eastAsia="Times New Roman" w:cs="Times New Roman"/>
+          <w:b/>
+          <w:bCs/>
+          <w:sz w:val="22"/>
+          <w:szCs w:val="22"/>
         </w:rPr>
         <w:t>Invois</w:t>
       </w:r>
@@ -151,13 +191,17 @@
       </w:r>
       <w:r>
         <w:rPr>
-          <w:rFonts w:ascii="Times New Roman" w:hAnsi="Times New Roman" w:cs="Times New Roman"/>
+          <w:rFonts w:ascii="Times New Roman" w:hAnsi="Times New Roman" w:eastAsia="Times New Roman" w:cs="Times New Roman"/>
+          <w:sz w:val="22"/>
+          <w:szCs w:val="22"/>
         </w:rPr>
         <w:t xml:space="preserve">: </w:t>
       </w:r>
       <w:r>
         <w:rPr>
-          <w:rFonts w:ascii="Times New Roman" w:hAnsi="Times New Roman" w:cs="Times New Roman"/>
+          <w:rFonts w:ascii="Times New Roman" w:hAnsi="Times New Roman" w:eastAsia="Times New Roman" w:cs="Times New Roman"/>
+          <w:sz w:val="22"/>
+          <w:szCs w:val="22"/>
         </w:rPr>
         <w:t xml:space="preserve">{nomorInvois}</w:t>
       </w:r>
@@ -166,22 +210,29 @@
       <w:pPr>
         <w:ind w:left="270"/>
         <w:rPr>
-          <w:rFonts w:ascii="Times New Roman" w:hAnsi="Times New Roman" w:cs="Times New Roman"/>
-        </w:rPr>
-      </w:pPr>
-      <w:r>
-        <w:rPr>
-          <w:rFonts w:ascii="Times New Roman" w:hAnsi="Times New Roman" w:cs="Times New Roman"/>
-          <w:b/>
-          <w:bCs/>
+          <w:rFonts w:ascii="Times New Roman" w:hAnsi="Times New Roman" w:eastAsia="Times New Roman" w:cs="Times New Roman"/>
+          <w:sz w:val="22"/>
+          <w:szCs w:val="22"/>
+        </w:rPr>
+        <w:spacing w:before="0" w:after="100" w:line="240" w:lineRule="auto"/>
+      </w:pPr>
+      <w:r>
+        <w:rPr>
+          <w:rFonts w:ascii="Times New Roman" w:hAnsi="Times New Roman" w:eastAsia="Times New Roman" w:cs="Times New Roman"/>
+          <w:b/>
+          <w:bCs/>
+          <w:sz w:val="22"/>
+          <w:szCs w:val="22"/>
         </w:rPr>
         <w:t xml:space="preserve">Tanggal </w:t>
       </w:r>
       <w:r>
         <w:rPr>
-          <w:rFonts w:ascii="Times New Roman" w:hAnsi="Times New Roman" w:cs="Times New Roman"/>
-          <w:b/>
-          <w:bCs/>
+          <w:rFonts w:ascii="Times New Roman" w:hAnsi="Times New Roman" w:eastAsia="Times New Roman" w:cs="Times New Roman"/>
+          <w:b/>
+          <w:bCs/>
+          <w:sz w:val="22"/>
+          <w:szCs w:val="22"/>
         </w:rPr>
         <w:t>Invois</w:t>
       </w:r>
@@ -190,13 +241,17 @@
       </w:r>
       <w:r>
         <w:rPr>
-          <w:rFonts w:ascii="Times New Roman" w:hAnsi="Times New Roman" w:cs="Times New Roman"/>
+          <w:rFonts w:ascii="Times New Roman" w:hAnsi="Times New Roman" w:eastAsia="Times New Roman" w:cs="Times New Roman"/>
+          <w:sz w:val="22"/>
+          <w:szCs w:val="22"/>
         </w:rPr>
         <w:t xml:space="preserve">: </w:t>
       </w:r>
       <w:r>
         <w:rPr>
-          <w:rFonts w:ascii="Times New Roman" w:hAnsi="Times New Roman" w:cs="Times New Roman"/>
+          <w:rFonts w:ascii="Times New Roman" w:hAnsi="Times New Roman" w:eastAsia="Times New Roman" w:cs="Times New Roman"/>
+          <w:sz w:val="22"/>
+          <w:szCs w:val="22"/>
         </w:rPr>
         <w:t xml:space="preserve">{tanggalInvois}</w:t>
       </w:r>
@@ -208,56 +263,72 @@
         <w:ind w:left="360"/>
         <w:jc w:val="right"/>
         <w:rPr>
-          <w:rFonts w:ascii="Times New Roman" w:hAnsi="Times New Roman" w:cs="Times New Roman"/>
-        </w:rPr>
+          <w:rFonts w:ascii="Times New Roman" w:hAnsi="Times New Roman" w:eastAsia="Times New Roman" w:cs="Times New Roman"/>
+          <w:sz w:val="22"/>
+          <w:szCs w:val="22"/>
+        </w:rPr>
+        <w:spacing w:before="0" w:after="100" w:line="240" w:lineRule="auto"/>
       </w:pPr>
     </w:p>
     <w:p>
       <w:pPr>
         <w:ind w:left="270"/>
         <w:rPr>
-          <w:rFonts w:ascii="Times New Roman" w:hAnsi="Times New Roman" w:cs="Times New Roman"/>
-          <w:b/>
-          <w:bCs/>
-        </w:rPr>
-      </w:pPr>
-      <w:r>
-        <w:rPr>
-          <w:rFonts w:ascii="Times New Roman" w:hAnsi="Times New Roman" w:cs="Times New Roman"/>
-          <w:b/>
-          <w:bCs/>
+          <w:rFonts w:ascii="Times New Roman" w:hAnsi="Times New Roman" w:eastAsia="Times New Roman" w:cs="Times New Roman"/>
+          <w:b/>
+          <w:bCs/>
+          <w:sz w:val="22"/>
+          <w:szCs w:val="22"/>
+        </w:rPr>
+        <w:spacing w:before="0" w:after="100" w:line="240" w:lineRule="auto"/>
+      </w:pPr>
+      <w:r>
+        <w:rPr>
+          <w:rFonts w:ascii="Times New Roman" w:hAnsi="Times New Roman" w:eastAsia="Times New Roman" w:cs="Times New Roman"/>
+          <w:b/>
+          <w:bCs/>
+          <w:sz w:val="22"/>
+          <w:szCs w:val="22"/>
         </w:rPr>
         <w:t>T</w:t>
       </w:r>
       <w:r>
         <w:rPr>
-          <w:rFonts w:ascii="Times New Roman" w:hAnsi="Times New Roman" w:cs="Times New Roman"/>
-          <w:b/>
-          <w:bCs/>
+          <w:rFonts w:ascii="Times New Roman" w:hAnsi="Times New Roman" w:eastAsia="Times New Roman" w:cs="Times New Roman"/>
+          <w:b/>
+          <w:bCs/>
+          <w:sz w:val="22"/>
+          <w:szCs w:val="22"/>
         </w:rPr>
         <w:t>agihan</w:t>
       </w:r>
       <w:r>
         <w:rPr>
-          <w:rFonts w:ascii="Times New Roman" w:hAnsi="Times New Roman" w:cs="Times New Roman"/>
-          <w:b/>
-          <w:bCs/>
+          <w:rFonts w:ascii="Times New Roman" w:hAnsi="Times New Roman" w:eastAsia="Times New Roman" w:cs="Times New Roman"/>
+          <w:b/>
+          <w:bCs/>
+          <w:sz w:val="22"/>
+          <w:szCs w:val="22"/>
         </w:rPr>
         <w:t xml:space="preserve"> </w:t>
       </w:r>
       <w:r>
         <w:rPr>
-          <w:rFonts w:ascii="Times New Roman" w:hAnsi="Times New Roman" w:cs="Times New Roman"/>
-          <w:b/>
-          <w:bCs/>
+          <w:rFonts w:ascii="Times New Roman" w:hAnsi="Times New Roman" w:eastAsia="Times New Roman" w:cs="Times New Roman"/>
+          <w:b/>
+          <w:bCs/>
+          <w:sz w:val="22"/>
+          <w:szCs w:val="22"/>
         </w:rPr>
         <w:t>Kepada</w:t>
       </w:r>
       <w:r>
         <w:rPr>
-          <w:rFonts w:ascii="Times New Roman" w:hAnsi="Times New Roman" w:cs="Times New Roman"/>
-          <w:b/>
-          <w:bCs/>
+          <w:rFonts w:ascii="Times New Roman" w:hAnsi="Times New Roman" w:eastAsia="Times New Roman" w:cs="Times New Roman"/>
+          <w:b/>
+          <w:bCs/>
+          <w:sz w:val="22"/>
+          <w:szCs w:val="22"/>
         </w:rPr>
         <w:t>:</w:t>
       </w:r>
@@ -267,35 +338,43 @@
       <w:proofErr w:type="spellStart"/>
       <w:r>
         <w:rPr>
-          <w:rFonts w:ascii="Times New Roman" w:hAnsi="Times New Roman" w:cs="Times New Roman"/>
-          <w:b/>
-          <w:bCs/>
+          <w:rFonts w:ascii="Times New Roman" w:hAnsi="Times New Roman" w:eastAsia="Times New Roman" w:cs="Times New Roman"/>
+          <w:b/>
+          <w:bCs/>
+          <w:sz w:val="22"/>
+          <w:szCs w:val="22"/>
         </w:rPr>
         <w:t>Perta</w:t>
       </w:r>
       <w:r>
         <w:rPr>
-          <w:rFonts w:ascii="Times New Roman" w:hAnsi="Times New Roman" w:cs="Times New Roman"/>
-          <w:b/>
-          <w:bCs/>
+          <w:rFonts w:ascii="Times New Roman" w:hAnsi="Times New Roman" w:eastAsia="Times New Roman" w:cs="Times New Roman"/>
+          <w:b/>
+          <w:bCs/>
+          <w:sz w:val="22"/>
+          <w:szCs w:val="22"/>
         </w:rPr>
         <w:t>mina</w:t>
       </w:r>
       <w:proofErr w:type="spellEnd"/>
       <w:r>
         <w:rPr>
-          <w:rFonts w:ascii="Times New Roman" w:hAnsi="Times New Roman" w:cs="Times New Roman"/>
-          <w:b/>
-          <w:bCs/>
+          <w:rFonts w:ascii="Times New Roman" w:hAnsi="Times New Roman" w:eastAsia="Times New Roman" w:cs="Times New Roman"/>
+          <w:b/>
+          <w:bCs/>
+          <w:sz w:val="22"/>
+          <w:szCs w:val="22"/>
         </w:rPr>
         <w:t xml:space="preserve"> </w:t>
       </w:r>
       <w:proofErr w:type="spellStart"/>
       <w:r>
         <w:rPr>
-          <w:rFonts w:ascii="Times New Roman" w:hAnsi="Times New Roman" w:cs="Times New Roman"/>
-          <w:b/>
-          <w:bCs/>
+          <w:rFonts w:ascii="Times New Roman" w:hAnsi="Times New Roman" w:eastAsia="Times New Roman" w:cs="Times New Roman"/>
+          <w:b/>
+          <w:bCs/>
+          <w:sz w:val="22"/>
+          <w:szCs w:val="22"/>
         </w:rPr>
         <w:t>Foundation</w:t>
       </w:r>
@@ -305,62 +384,81 @@
       <w:pPr>
         <w:ind w:left="270"/>
         <w:rPr>
-          <w:rFonts w:ascii="Times New Roman" w:hAnsi="Times New Roman" w:cs="Times New Roman"/>
-        </w:rPr>
+          <w:rFonts w:ascii="Times New Roman" w:hAnsi="Times New Roman" w:eastAsia="Times New Roman" w:cs="Times New Roman"/>
+          <w:sz w:val="22"/>
+          <w:szCs w:val="22"/>
+        </w:rPr>
+        <w:spacing w:before="0" w:after="100" w:line="240" w:lineRule="auto"/>
       </w:pPr>
       <w:proofErr w:type="spellStart"/>
       <w:r>
         <w:rPr>
-          <w:rFonts w:ascii="Times New Roman" w:hAnsi="Times New Roman" w:cs="Times New Roman"/>
+          <w:rFonts w:ascii="Times New Roman" w:hAnsi="Times New Roman" w:eastAsia="Times New Roman" w:cs="Times New Roman"/>
+          <w:sz w:val="22"/>
+          <w:szCs w:val="22"/>
         </w:rPr>
         <w:t>Jl</w:t>
       </w:r>
       <w:proofErr w:type="spellEnd"/>
       <w:r>
         <w:rPr>
-          <w:rFonts w:ascii="Times New Roman" w:hAnsi="Times New Roman" w:cs="Times New Roman"/>
+          <w:rFonts w:ascii="Times New Roman" w:hAnsi="Times New Roman" w:eastAsia="Times New Roman" w:cs="Times New Roman"/>
+          <w:sz w:val="22"/>
+          <w:szCs w:val="22"/>
         </w:rPr>
         <w:t xml:space="preserve">. </w:t>
       </w:r>
       <w:proofErr w:type="spellStart"/>
       <w:r>
         <w:rPr>
-          <w:rFonts w:ascii="Times New Roman" w:hAnsi="Times New Roman" w:cs="Times New Roman"/>
+          <w:rFonts w:ascii="Times New Roman" w:hAnsi="Times New Roman" w:eastAsia="Times New Roman" w:cs="Times New Roman"/>
+          <w:sz w:val="22"/>
+          <w:szCs w:val="22"/>
         </w:rPr>
         <w:t>Teuku</w:t>
       </w:r>
       <w:proofErr w:type="spellEnd"/>
       <w:r>
         <w:rPr>
-          <w:rFonts w:ascii="Times New Roman" w:hAnsi="Times New Roman" w:cs="Times New Roman"/>
+          <w:rFonts w:ascii="Times New Roman" w:hAnsi="Times New Roman" w:eastAsia="Times New Roman" w:cs="Times New Roman"/>
+          <w:sz w:val="22"/>
+          <w:szCs w:val="22"/>
         </w:rPr>
         <w:t xml:space="preserve"> Nyak </w:t>
       </w:r>
       <w:proofErr w:type="spellStart"/>
       <w:r>
         <w:rPr>
-          <w:rFonts w:ascii="Times New Roman" w:hAnsi="Times New Roman" w:cs="Times New Roman"/>
+          <w:rFonts w:ascii="Times New Roman" w:hAnsi="Times New Roman" w:eastAsia="Times New Roman" w:cs="Times New Roman"/>
+          <w:sz w:val="22"/>
+          <w:szCs w:val="22"/>
         </w:rPr>
         <w:t>Arief</w:t>
       </w:r>
       <w:proofErr w:type="spellEnd"/>
       <w:r>
         <w:rPr>
-          <w:rFonts w:ascii="Times New Roman" w:hAnsi="Times New Roman" w:cs="Times New Roman"/>
+          <w:rFonts w:ascii="Times New Roman" w:hAnsi="Times New Roman" w:eastAsia="Times New Roman" w:cs="Times New Roman"/>
+          <w:sz w:val="22"/>
+          <w:szCs w:val="22"/>
         </w:rPr>
         <w:t xml:space="preserve">, RT 07/RW 08, </w:t>
       </w:r>
       <w:proofErr w:type="spellStart"/>
       <w:r>
         <w:rPr>
-          <w:rFonts w:ascii="Times New Roman" w:hAnsi="Times New Roman" w:cs="Times New Roman"/>
+          <w:rFonts w:ascii="Times New Roman" w:hAnsi="Times New Roman" w:eastAsia="Times New Roman" w:cs="Times New Roman"/>
+          <w:sz w:val="22"/>
+          <w:szCs w:val="22"/>
         </w:rPr>
         <w:t>Grogol</w:t>
       </w:r>
       <w:proofErr w:type="spellEnd"/>
       <w:r>
         <w:rPr>
-          <w:rFonts w:ascii="Times New Roman" w:hAnsi="Times New Roman" w:cs="Times New Roman"/>
+          <w:rFonts w:ascii="Times New Roman" w:hAnsi="Times New Roman" w:eastAsia="Times New Roman" w:cs="Times New Roman"/>
+          <w:sz w:val="22"/>
+          <w:szCs w:val="22"/>
         </w:rPr>
         <w:t xml:space="preserve"> Selatan,</w:t>
       </w:r>
@@ -369,20 +467,27 @@
       <w:pPr>
         <w:ind w:left="270"/>
         <w:rPr>
-          <w:rFonts w:ascii="Times New Roman" w:hAnsi="Times New Roman" w:cs="Times New Roman"/>
-        </w:rPr>
+          <w:rFonts w:ascii="Times New Roman" w:hAnsi="Times New Roman" w:eastAsia="Times New Roman" w:cs="Times New Roman"/>
+          <w:sz w:val="22"/>
+          <w:szCs w:val="22"/>
+        </w:rPr>
+        <w:spacing w:before="0" w:after="100" w:line="240" w:lineRule="auto"/>
       </w:pPr>
       <w:proofErr w:type="spellStart"/>
       <w:r>
         <w:rPr>
-          <w:rFonts w:ascii="Times New Roman" w:hAnsi="Times New Roman" w:cs="Times New Roman"/>
+          <w:rFonts w:ascii="Times New Roman" w:hAnsi="Times New Roman" w:eastAsia="Times New Roman" w:cs="Times New Roman"/>
+          <w:sz w:val="22"/>
+          <w:szCs w:val="22"/>
         </w:rPr>
         <w:t>Kebayoran</w:t>
       </w:r>
       <w:proofErr w:type="spellEnd"/>
       <w:r>
         <w:rPr>
-          <w:rFonts w:ascii="Times New Roman" w:hAnsi="Times New Roman" w:cs="Times New Roman"/>
+          <w:rFonts w:ascii="Times New Roman" w:hAnsi="Times New Roman" w:eastAsia="Times New Roman" w:cs="Times New Roman"/>
+          <w:sz w:val="22"/>
+          <w:szCs w:val="22"/>
         </w:rPr>
         <w:t xml:space="preserve"> Lama, Jakarta Selatan 12220</w:t>
       </w:r>
@@ -391,8 +496,11 @@
       <w:pPr>
         <w:ind w:left="270"/>
         <w:rPr>
-          <w:rFonts w:ascii="Times New Roman" w:hAnsi="Times New Roman" w:cs="Times New Roman"/>
-        </w:rPr>
+          <w:rFonts w:ascii="Times New Roman" w:hAnsi="Times New Roman" w:eastAsia="Times New Roman" w:cs="Times New Roman"/>
+          <w:sz w:val="22"/>
+          <w:szCs w:val="22"/>
+        </w:rPr>
+        <w:spacing w:before="0" w:after="100" w:line="240" w:lineRule="auto"/>
       </w:pPr>
     </w:p>
     <w:tbl>
@@ -421,16 +529,21 @@
           <w:p>
             <w:pPr>
               <w:rPr>
-                <w:rFonts w:ascii="Times New Roman" w:hAnsi="Times New Roman" w:cs="Times New Roman"/>
+                <w:rFonts w:ascii="Times New Roman" w:hAnsi="Times New Roman" w:eastAsia="Times New Roman" w:cs="Times New Roman"/>
                 <w:b/>
                 <w:bCs/>
-              </w:rPr>
+                <w:sz w:val="22"/>
+                <w:szCs w:val="22"/>
+              </w:rPr>
+              <w:spacing w:before="0" w:after="100" w:line="240" w:lineRule="auto"/>
             </w:pPr>
             <w:r>
               <w:rPr>
-                <w:rFonts w:ascii="Times New Roman" w:hAnsi="Times New Roman" w:cs="Times New Roman"/>
+                <w:rFonts w:ascii="Times New Roman" w:hAnsi="Times New Roman" w:eastAsia="Times New Roman" w:cs="Times New Roman"/>
                 <w:b/>
                 <w:bCs/>
+                <w:sz w:val="22"/>
+                <w:szCs w:val="22"/>
               </w:rPr>
               <w:t>No.</w:t>
             </w:r>
@@ -444,16 +557,21 @@
           <w:p>
             <w:pPr>
               <w:rPr>
-                <w:rFonts w:ascii="Times New Roman" w:hAnsi="Times New Roman" w:cs="Times New Roman"/>
+                <w:rFonts w:ascii="Times New Roman" w:hAnsi="Times New Roman" w:eastAsia="Times New Roman" w:cs="Times New Roman"/>
                 <w:b/>
                 <w:bCs/>
-              </w:rPr>
+                <w:sz w:val="22"/>
+                <w:szCs w:val="22"/>
+              </w:rPr>
+              <w:spacing w:before="0" w:after="100" w:line="240" w:lineRule="auto"/>
             </w:pPr>
             <w:r>
               <w:rPr>
-                <w:rFonts w:ascii="Times New Roman" w:hAnsi="Times New Roman" w:cs="Times New Roman"/>
+                <w:rFonts w:ascii="Times New Roman" w:hAnsi="Times New Roman" w:eastAsia="Times New Roman" w:cs="Times New Roman"/>
                 <w:b/>
                 <w:bCs/>
+                <w:sz w:val="22"/>
+                <w:szCs w:val="22"/>
               </w:rPr>
               <w:t>Deskripsi</w:t>
             </w:r>
@@ -467,16 +585,21 @@
           <w:p>
             <w:pPr>
               <w:rPr>
-                <w:rFonts w:ascii="Times New Roman" w:hAnsi="Times New Roman" w:cs="Times New Roman"/>
+                <w:rFonts w:ascii="Times New Roman" w:hAnsi="Times New Roman" w:eastAsia="Times New Roman" w:cs="Times New Roman"/>
                 <w:b/>
                 <w:bCs/>
-              </w:rPr>
+                <w:sz w:val="22"/>
+                <w:szCs w:val="22"/>
+              </w:rPr>
+              <w:spacing w:before="0" w:after="100" w:line="240" w:lineRule="auto"/>
             </w:pPr>
             <w:r>
               <w:rPr>
-                <w:rFonts w:ascii="Times New Roman" w:hAnsi="Times New Roman" w:cs="Times New Roman"/>
+                <w:rFonts w:ascii="Times New Roman" w:hAnsi="Times New Roman" w:eastAsia="Times New Roman" w:cs="Times New Roman"/>
                 <w:b/>
                 <w:bCs/>
+                <w:sz w:val="22"/>
+                <w:szCs w:val="22"/>
               </w:rPr>
               <w:t>Unit</w:t>
             </w:r>
@@ -490,17 +613,22 @@
           <w:p>
             <w:pPr>
               <w:rPr>
-                <w:rFonts w:ascii="Times New Roman" w:hAnsi="Times New Roman" w:cs="Times New Roman"/>
+                <w:rFonts w:ascii="Times New Roman" w:hAnsi="Times New Roman" w:eastAsia="Times New Roman" w:cs="Times New Roman"/>
                 <w:b/>
                 <w:bCs/>
-              </w:rPr>
+                <w:sz w:val="22"/>
+                <w:szCs w:val="22"/>
+              </w:rPr>
+              <w:spacing w:before="0" w:after="100" w:line="240" w:lineRule="auto"/>
             </w:pPr>
             <w:proofErr w:type="spellStart"/>
             <w:r>
               <w:rPr>
-                <w:rFonts w:ascii="Times New Roman" w:hAnsi="Times New Roman" w:cs="Times New Roman"/>
+                <w:rFonts w:ascii="Times New Roman" w:hAnsi="Times New Roman" w:eastAsia="Times New Roman" w:cs="Times New Roman"/>
                 <w:b/>
                 <w:bCs/>
+                <w:sz w:val="22"/>
+                <w:szCs w:val="22"/>
               </w:rPr>
               <w:t>Nominal</w:t>
             </w:r>
@@ -519,12 +647,17 @@
           <w:p>
             <w:pPr>
               <w:rPr>
-                <w:rFonts w:ascii="Times New Roman" w:hAnsi="Times New Roman" w:cs="Times New Roman"/>
-              </w:rPr>
+                <w:rFonts w:ascii="Times New Roman" w:hAnsi="Times New Roman" w:eastAsia="Times New Roman" w:cs="Times New Roman"/>
+                <w:sz w:val="22"/>
+                <w:szCs w:val="22"/>
+              </w:rPr>
+              <w:spacing w:before="0" w:after="100" w:line="240" w:lineRule="auto"/>
             </w:pPr>
             <w:r>
               <w:rPr>
-                <w:rFonts w:ascii="Times New Roman" w:hAnsi="Times New Roman" w:cs="Times New Roman"/>
+                <w:rFonts w:ascii="Times New Roman" w:hAnsi="Times New Roman" w:eastAsia="Times New Roman" w:cs="Times New Roman"/>
+                <w:sz w:val="22"/>
+                <w:szCs w:val="22"/>
               </w:rPr>
               <w:t>1.</w:t>
             </w:r>
@@ -537,70 +670,92 @@
           <w:p>
             <w:pPr>
               <w:rPr>
-                <w:rFonts w:ascii="Times New Roman" w:hAnsi="Times New Roman" w:cs="Times New Roman"/>
-                <w:highlight w:val="yellow"/>
-              </w:rPr>
+                <w:rFonts w:ascii="Times New Roman" w:hAnsi="Times New Roman" w:eastAsia="Times New Roman" w:cs="Times New Roman"/>
+                <w:sz w:val="22"/>
+                <w:szCs w:val="22"/>
+              </w:rPr>
+              <w:spacing w:before="0" w:after="100" w:line="240" w:lineRule="auto"/>
             </w:pPr>
             <w:r>
               <w:rPr>
-                <w:rFonts w:ascii="Times New Roman" w:hAnsi="Times New Roman" w:cs="Times New Roman"/>
+                <w:rFonts w:ascii="Times New Roman" w:hAnsi="Times New Roman" w:eastAsia="Times New Roman" w:cs="Times New Roman"/>
+                <w:sz w:val="22"/>
+                <w:szCs w:val="22"/>
               </w:rPr>
               <w:t>Pencairan Bantuan Implementasi Pro</w:t>
             </w:r>
             <w:r>
               <w:rPr>
-                <w:rFonts w:ascii="Times New Roman" w:hAnsi="Times New Roman" w:cs="Times New Roman"/>
+                <w:rFonts w:ascii="Times New Roman" w:hAnsi="Times New Roman" w:eastAsia="Times New Roman" w:cs="Times New Roman"/>
+                <w:sz w:val="22"/>
+                <w:szCs w:val="22"/>
               </w:rPr>
               <w:t>gram</w:t>
             </w:r>
             <w:r>
               <w:rPr>
-                <w:rFonts w:ascii="Times New Roman" w:hAnsi="Times New Roman" w:cs="Times New Roman"/>
+                <w:rFonts w:ascii="Times New Roman" w:hAnsi="Times New Roman" w:eastAsia="Times New Roman" w:cs="Times New Roman"/>
+                <w:sz w:val="22"/>
+                <w:szCs w:val="22"/>
               </w:rPr>
               <w:t xml:space="preserve"> Desa </w:t>
             </w:r>
             <w:proofErr w:type="spellStart"/>
             <w:r>
               <w:rPr>
-                <w:rFonts w:ascii="Times New Roman" w:hAnsi="Times New Roman" w:cs="Times New Roman"/>
+                <w:rFonts w:ascii="Times New Roman" w:hAnsi="Times New Roman" w:eastAsia="Times New Roman" w:cs="Times New Roman"/>
+                <w:sz w:val="22"/>
+                <w:szCs w:val="22"/>
               </w:rPr>
               <w:t>Energi</w:t>
             </w:r>
             <w:proofErr w:type="spellEnd"/>
             <w:r>
               <w:rPr>
-                <w:rFonts w:ascii="Times New Roman" w:hAnsi="Times New Roman" w:cs="Times New Roman"/>
+                <w:rFonts w:ascii="Times New Roman" w:hAnsi="Times New Roman" w:eastAsia="Times New Roman" w:cs="Times New Roman"/>
+                <w:sz w:val="22"/>
+                <w:szCs w:val="22"/>
               </w:rPr>
               <w:t xml:space="preserve"> Berdikari Sobat Bumi </w:t>
             </w:r>
             <w:r>
               <w:rPr>
-                <w:rFonts w:ascii="Times New Roman" w:hAnsi="Times New Roman" w:cs="Times New Roman"/>
+                <w:rFonts w:ascii="Times New Roman" w:hAnsi="Times New Roman" w:eastAsia="Times New Roman" w:cs="Times New Roman"/>
+                <w:sz w:val="22"/>
+                <w:szCs w:val="22"/>
               </w:rPr>
               <w:t>Termin-1 (</w:t>
             </w:r>
             <w:r>
               <w:rPr>
-                <w:rFonts w:ascii="Times New Roman" w:hAnsi="Times New Roman" w:cs="Times New Roman"/>
+                <w:rFonts w:ascii="Times New Roman" w:hAnsi="Times New Roman" w:eastAsia="Times New Roman" w:cs="Times New Roman"/>
+                <w:sz w:val="22"/>
+                <w:szCs w:val="22"/>
               </w:rPr>
               <w:t>7</w:t>
             </w:r>
             <w:r>
               <w:rPr>
-                <w:rFonts w:ascii="Times New Roman" w:hAnsi="Times New Roman" w:cs="Times New Roman"/>
+                <w:rFonts w:ascii="Times New Roman" w:hAnsi="Times New Roman" w:eastAsia="Times New Roman" w:cs="Times New Roman"/>
+                <w:sz w:val="22"/>
+                <w:szCs w:val="22"/>
               </w:rPr>
               <w:t>0%)</w:t>
             </w:r>
             <w:r>
               <w:rPr>
-                <w:rFonts w:ascii="Times New Roman" w:hAnsi="Times New Roman" w:cs="Times New Roman"/>
+                <w:rFonts w:ascii="Times New Roman" w:hAnsi="Times New Roman" w:eastAsia="Times New Roman" w:cs="Times New Roman"/>
+                <w:sz w:val="22"/>
+                <w:szCs w:val="22"/>
               </w:rPr>
               <w:t xml:space="preserve"> dengan judul </w:t>
             </w:r>
             <w:proofErr w:type="spellStart"/>
             <w:r>
               <w:rPr>
-                <w:rFonts w:ascii="Times New Roman" w:hAnsi="Times New Roman" w:cs="Times New Roman"/>
+                <w:rFonts w:ascii="Times New Roman" w:hAnsi="Times New Roman" w:eastAsia="Times New Roman" w:cs="Times New Roman"/>
+                <w:sz w:val="22"/>
+                <w:szCs w:val="22"/>
               </w:rPr>
               <w:t xml:space="preserve">{judulProgram}</w:t>
             </w:r>
@@ -615,12 +770,17 @@
             <w:pPr>
               <w:jc w:val="center"/>
               <w:rPr>
-                <w:rFonts w:ascii="Times New Roman" w:hAnsi="Times New Roman" w:cs="Times New Roman"/>
-              </w:rPr>
+                <w:rFonts w:ascii="Times New Roman" w:hAnsi="Times New Roman" w:eastAsia="Times New Roman" w:cs="Times New Roman"/>
+                <w:sz w:val="22"/>
+                <w:szCs w:val="22"/>
+              </w:rPr>
+              <w:spacing w:before="0" w:after="100" w:line="240" w:lineRule="auto"/>
             </w:pPr>
             <w:r>
               <w:rPr>
-                <w:rFonts w:ascii="Times New Roman" w:hAnsi="Times New Roman" w:cs="Times New Roman"/>
+                <w:rFonts w:ascii="Times New Roman" w:hAnsi="Times New Roman" w:eastAsia="Times New Roman" w:cs="Times New Roman"/>
+                <w:sz w:val="22"/>
+                <w:szCs w:val="22"/>
               </w:rPr>
               <w:t>1</w:t>
             </w:r>
@@ -633,14 +793,18 @@
           <w:p>
             <w:pPr>
               <w:rPr>
-                <w:rFonts w:ascii="Times New Roman" w:hAnsi="Times New Roman" w:cs="Times New Roman"/>
-                <w:highlight w:val="yellow"/>
-              </w:rPr>
+                <w:rFonts w:ascii="Times New Roman" w:hAnsi="Times New Roman" w:eastAsia="Times New Roman" w:cs="Times New Roman"/>
+                <w:sz w:val="22"/>
+                <w:szCs w:val="22"/>
+              </w:rPr>
+              <w:spacing w:before="0" w:after="100" w:line="240" w:lineRule="auto"/>
             </w:pPr>
             <w:proofErr w:type="spellStart"/>
             <w:r>
               <w:rPr>
-                <w:rFonts w:ascii="Times New Roman" w:hAnsi="Times New Roman" w:cs="Times New Roman"/>
+                <w:rFonts w:ascii="Times New Roman" w:hAnsi="Times New Roman" w:eastAsia="Times New Roman" w:cs="Times New Roman"/>
+                <w:sz w:val="22"/>
+                <w:szCs w:val="22"/>
               </w:rPr>
               <w:t xml:space="preserve">{termin1}</w:t>
             </w:r>
@@ -661,16 +825,21 @@
             <w:pPr>
               <w:jc w:val="center"/>
               <w:rPr>
-                <w:rFonts w:ascii="Times New Roman" w:hAnsi="Times New Roman" w:cs="Times New Roman"/>
+                <w:rFonts w:ascii="Times New Roman" w:hAnsi="Times New Roman" w:eastAsia="Times New Roman" w:cs="Times New Roman"/>
                 <w:b/>
                 <w:bCs/>
-              </w:rPr>
+                <w:sz w:val="22"/>
+                <w:szCs w:val="22"/>
+              </w:rPr>
+              <w:spacing w:before="0" w:after="100" w:line="240" w:lineRule="auto"/>
             </w:pPr>
             <w:r>
               <w:rPr>
-                <w:rFonts w:ascii="Times New Roman" w:hAnsi="Times New Roman" w:cs="Times New Roman"/>
+                <w:rFonts w:ascii="Times New Roman" w:hAnsi="Times New Roman" w:eastAsia="Times New Roman" w:cs="Times New Roman"/>
                 <w:b/>
                 <w:bCs/>
+                <w:sz w:val="22"/>
+                <w:szCs w:val="22"/>
               </w:rPr>
               <w:t>TOTAL</w:t>
             </w:r>
@@ -683,18 +852,22 @@
           <w:p>
             <w:pPr>
               <w:rPr>
-                <w:rFonts w:ascii="Times New Roman" w:hAnsi="Times New Roman" w:cs="Times New Roman"/>
+                <w:rFonts w:ascii="Times New Roman" w:hAnsi="Times New Roman" w:eastAsia="Times New Roman" w:cs="Times New Roman"/>
                 <w:b/>
                 <w:bCs/>
-                <w:highlight w:val="yellow"/>
-              </w:rPr>
+                <w:sz w:val="22"/>
+                <w:szCs w:val="22"/>
+              </w:rPr>
+              <w:spacing w:before="0" w:after="100" w:line="240" w:lineRule="auto"/>
             </w:pPr>
             <w:proofErr w:type="spellStart"/>
             <w:r>
               <w:rPr>
-                <w:rFonts w:ascii="Times New Roman" w:hAnsi="Times New Roman" w:cs="Times New Roman"/>
+                <w:rFonts w:ascii="Times New Roman" w:hAnsi="Times New Roman" w:eastAsia="Times New Roman" w:cs="Times New Roman"/>
                 <w:b/>
                 <w:bCs/>
+                <w:sz w:val="22"/>
+                <w:szCs w:val="22"/>
               </w:rPr>
               <w:t xml:space="preserve">{termin1}</w:t>
             </w:r>
@@ -707,33 +880,45 @@
       <w:pPr>
         <w:ind w:left="270"/>
         <w:rPr>
-          <w:rFonts w:ascii="Times New Roman" w:hAnsi="Times New Roman" w:cs="Times New Roman"/>
-        </w:rPr>
+          <w:rFonts w:ascii="Times New Roman" w:hAnsi="Times New Roman" w:eastAsia="Times New Roman" w:cs="Times New Roman"/>
+          <w:sz w:val="22"/>
+          <w:szCs w:val="22"/>
+        </w:rPr>
+        <w:spacing w:before="0" w:after="100" w:line="240" w:lineRule="auto"/>
       </w:pPr>
     </w:p>
     <w:p>
       <w:pPr>
         <w:rPr>
-          <w:rFonts w:ascii="Times New Roman" w:hAnsi="Times New Roman" w:cs="Times New Roman"/>
-        </w:rPr>
-      </w:pPr>
-      <w:r>
-        <w:rPr>
-          <w:rFonts w:ascii="Times New Roman" w:hAnsi="Times New Roman" w:cs="Times New Roman"/>
+          <w:rFonts w:ascii="Times New Roman" w:hAnsi="Times New Roman" w:eastAsia="Times New Roman" w:cs="Times New Roman"/>
+          <w:sz w:val="22"/>
+          <w:szCs w:val="22"/>
+        </w:rPr>
+        <w:spacing w:before="0" w:after="100" w:line="240" w:lineRule="auto"/>
+      </w:pPr>
+      <w:r>
+        <w:rPr>
+          <w:rFonts w:ascii="Times New Roman" w:hAnsi="Times New Roman" w:eastAsia="Times New Roman" w:cs="Times New Roman"/>
+          <w:sz w:val="22"/>
+          <w:szCs w:val="22"/>
         </w:rPr>
         <w:t xml:space="preserve">Pembayaran atas invois mohon agar dapat </w:t>
       </w:r>
       <w:proofErr w:type="spellStart"/>
       <w:r>
         <w:rPr>
-          <w:rFonts w:ascii="Times New Roman" w:hAnsi="Times New Roman" w:cs="Times New Roman"/>
+          <w:rFonts w:ascii="Times New Roman" w:hAnsi="Times New Roman" w:eastAsia="Times New Roman" w:cs="Times New Roman"/>
+          <w:sz w:val="22"/>
+          <w:szCs w:val="22"/>
         </w:rPr>
         <w:t>ditransfer</w:t>
       </w:r>
       <w:proofErr w:type="spellEnd"/>
       <w:r>
         <w:rPr>
-          <w:rFonts w:ascii="Times New Roman" w:hAnsi="Times New Roman" w:cs="Times New Roman"/>
+          <w:rFonts w:ascii="Times New Roman" w:hAnsi="Times New Roman" w:eastAsia="Times New Roman" w:cs="Times New Roman"/>
+          <w:sz w:val="22"/>
+          <w:szCs w:val="22"/>
         </w:rPr>
         <w:t xml:space="preserve"> ke</w:t>
       </w:r>
@@ -741,14 +926,19 @@
     <w:p>
       <w:pPr>
         <w:rPr>
-          <w:rFonts w:ascii="Times New Roman" w:eastAsia="Times New Roman" w:hAnsi="Times New Roman" w:cs="Times New Roman"/>
-        </w:rPr>
-      </w:pPr>
-      <w:r>
-        <w:rPr>
-          <w:rFonts w:ascii="Times New Roman" w:hAnsi="Times New Roman" w:cs="Times New Roman"/>
-          <w:b/>
-          <w:bCs/>
+          <w:rFonts w:ascii="Times New Roman" w:hAnsi="Times New Roman" w:eastAsia="Times New Roman" w:cs="Times New Roman"/>
+          <w:sz w:val="22"/>
+          <w:szCs w:val="22"/>
+        </w:rPr>
+        <w:spacing w:before="0" w:after="100" w:line="240" w:lineRule="auto"/>
+      </w:pPr>
+      <w:r>
+        <w:rPr>
+          <w:rFonts w:ascii="Times New Roman" w:hAnsi="Times New Roman" w:eastAsia="Times New Roman" w:cs="Times New Roman"/>
+          <w:b/>
+          <w:bCs/>
+          <w:sz w:val="22"/>
+          <w:szCs w:val="22"/>
         </w:rPr>
         <w:t>Bank</w:t>
       </w:r>
@@ -763,16 +953,20 @@
       </w:r>
       <w:r>
         <w:rPr>
-          <w:rFonts w:ascii="Times New Roman" w:hAnsi="Times New Roman" w:cs="Times New Roman"/>
-          <w:b/>
-          <w:bCs/>
+          <w:rFonts w:ascii="Times New Roman" w:hAnsi="Times New Roman" w:eastAsia="Times New Roman" w:cs="Times New Roman"/>
+          <w:b/>
+          <w:bCs/>
+          <w:sz w:val="22"/>
+          <w:szCs w:val="22"/>
         </w:rPr>
         <w:t xml:space="preserve">: </w:t>
       </w:r>
       <w:r>
         <w:rPr>
-          <w:rFonts w:ascii="Times New Roman" w:eastAsia="Times New Roman" w:hAnsi="Times New Roman" w:cs="Times New Roman"/>
+          <w:rFonts w:ascii="Times New Roman" w:hAnsi="Times New Roman" w:eastAsia="Times New Roman" w:cs="Times New Roman"/>
           <w:color w:val="000000" w:themeColor="text1"/>
+          <w:sz w:val="22"/>
+          <w:szCs w:val="22"/>
         </w:rPr>
         <w:t xml:space="preserve">{namaBank}</w:t>
       </w:r>
@@ -780,24 +974,30 @@
     <w:p>
       <w:pPr>
         <w:rPr>
-          <w:rFonts w:ascii="Times New Roman" w:eastAsia="Times New Roman" w:hAnsi="Times New Roman" w:cs="Times New Roman"/>
-          <w:highlight w:val="yellow"/>
-        </w:rPr>
-      </w:pPr>
-      <w:r>
-        <w:rPr>
-          <w:rFonts w:ascii="Times New Roman" w:hAnsi="Times New Roman" w:cs="Times New Roman"/>
-          <w:b/>
-          <w:bCs/>
+          <w:rFonts w:ascii="Times New Roman" w:hAnsi="Times New Roman" w:eastAsia="Times New Roman" w:cs="Times New Roman"/>
+          <w:sz w:val="22"/>
+          <w:szCs w:val="22"/>
+        </w:rPr>
+        <w:spacing w:before="0" w:after="100" w:line="240" w:lineRule="auto"/>
+      </w:pPr>
+      <w:r>
+        <w:rPr>
+          <w:rFonts w:ascii="Times New Roman" w:hAnsi="Times New Roman" w:eastAsia="Times New Roman" w:cs="Times New Roman"/>
+          <w:b/>
+          <w:bCs/>
+          <w:sz w:val="22"/>
+          <w:szCs w:val="22"/>
         </w:rPr>
         <w:t xml:space="preserve">No. </w:t>
       </w:r>
       <w:proofErr w:type="spellStart"/>
       <w:r>
         <w:rPr>
-          <w:rFonts w:ascii="Times New Roman" w:hAnsi="Times New Roman" w:cs="Times New Roman"/>
-          <w:b/>
-          <w:bCs/>
+          <w:rFonts w:ascii="Times New Roman" w:hAnsi="Times New Roman" w:eastAsia="Times New Roman" w:cs="Times New Roman"/>
+          <w:b/>
+          <w:bCs/>
+          <w:sz w:val="22"/>
+          <w:szCs w:val="22"/>
         </w:rPr>
         <w:t>Rekening</w:t>
       </w:r>
@@ -810,16 +1010,20 @@
       </w:r>
       <w:r>
         <w:rPr>
-          <w:rFonts w:ascii="Times New Roman" w:hAnsi="Times New Roman" w:cs="Times New Roman"/>
-          <w:b/>
-          <w:bCs/>
+          <w:rFonts w:ascii="Times New Roman" w:hAnsi="Times New Roman" w:eastAsia="Times New Roman" w:cs="Times New Roman"/>
+          <w:b/>
+          <w:bCs/>
+          <w:sz w:val="22"/>
+          <w:szCs w:val="22"/>
         </w:rPr>
         <w:t xml:space="preserve">: </w:t>
       </w:r>
       <w:r>
         <w:rPr>
-          <w:rFonts w:ascii="Times New Roman" w:eastAsia="Times New Roman" w:hAnsi="Times New Roman" w:cs="Times New Roman"/>
+          <w:rFonts w:ascii="Times New Roman" w:hAnsi="Times New Roman" w:eastAsia="Times New Roman" w:cs="Times New Roman"/>
           <w:color w:val="000000" w:themeColor="text1"/>
+          <w:sz w:val="22"/>
+          <w:szCs w:val="22"/>
         </w:rPr>
         <w:t xml:space="preserve">{nomorRekening}</w:t>
       </w:r>
@@ -827,23 +1031,30 @@
     <w:p>
       <w:pPr>
         <w:rPr>
-          <w:rFonts w:ascii="Times New Roman" w:eastAsia="Times New Roman" w:hAnsi="Times New Roman" w:cs="Times New Roman"/>
-        </w:rPr>
-      </w:pPr>
-      <w:r>
-        <w:rPr>
-          <w:rFonts w:ascii="Times New Roman" w:hAnsi="Times New Roman" w:cs="Times New Roman"/>
-          <w:b/>
-          <w:bCs/>
+          <w:rFonts w:ascii="Times New Roman" w:hAnsi="Times New Roman" w:eastAsia="Times New Roman" w:cs="Times New Roman"/>
+          <w:sz w:val="22"/>
+          <w:szCs w:val="22"/>
+        </w:rPr>
+        <w:spacing w:before="0" w:after="100" w:line="240" w:lineRule="auto"/>
+      </w:pPr>
+      <w:r>
+        <w:rPr>
+          <w:rFonts w:ascii="Times New Roman" w:hAnsi="Times New Roman" w:eastAsia="Times New Roman" w:cs="Times New Roman"/>
+          <w:b/>
+          <w:bCs/>
+          <w:sz w:val="22"/>
+          <w:szCs w:val="22"/>
         </w:rPr>
         <w:t xml:space="preserve">Nama </w:t>
       </w:r>
       <w:proofErr w:type="spellStart"/>
       <w:r>
         <w:rPr>
-          <w:rFonts w:ascii="Times New Roman" w:hAnsi="Times New Roman" w:cs="Times New Roman"/>
-          <w:b/>
-          <w:bCs/>
+          <w:rFonts w:ascii="Times New Roman" w:hAnsi="Times New Roman" w:eastAsia="Times New Roman" w:cs="Times New Roman"/>
+          <w:b/>
+          <w:bCs/>
+          <w:sz w:val="22"/>
+          <w:szCs w:val="22"/>
         </w:rPr>
         <w:t>Rekening</w:t>
       </w:r>
@@ -853,17 +1064,21 @@
       </w:r>
       <w:r>
         <w:rPr>
-          <w:rFonts w:ascii="Times New Roman" w:hAnsi="Times New Roman" w:cs="Times New Roman"/>
-          <w:b/>
-          <w:bCs/>
+          <w:rFonts w:ascii="Times New Roman" w:hAnsi="Times New Roman" w:eastAsia="Times New Roman" w:cs="Times New Roman"/>
+          <w:b/>
+          <w:bCs/>
+          <w:sz w:val="22"/>
+          <w:szCs w:val="22"/>
         </w:rPr>
         <w:t xml:space="preserve">: </w:t>
       </w:r>
       <w:proofErr w:type="spellStart"/>
       <w:r>
         <w:rPr>
-          <w:rFonts w:ascii="Times New Roman" w:eastAsia="Times New Roman" w:hAnsi="Times New Roman" w:cs="Times New Roman"/>
+          <w:rFonts w:ascii="Times New Roman" w:hAnsi="Times New Roman" w:eastAsia="Times New Roman" w:cs="Times New Roman"/>
           <w:color w:val="000000" w:themeColor="text1"/>
+          <w:sz w:val="22"/>
+          <w:szCs w:val="22"/>
         </w:rPr>
         <w:t xml:space="preserve">{namaPemilikRekening}</w:t>
       </w:r>
@@ -874,22 +1089,31 @@
     <w:p>
       <w:pPr>
         <w:rPr>
-          <w:rFonts w:ascii="Times New Roman" w:hAnsi="Times New Roman" w:cs="Times New Roman"/>
-        </w:rPr>
+          <w:rFonts w:ascii="Times New Roman" w:hAnsi="Times New Roman" w:eastAsia="Times New Roman" w:cs="Times New Roman"/>
+          <w:sz w:val="22"/>
+          <w:szCs w:val="22"/>
+        </w:rPr>
+        <w:spacing w:before="0" w:after="100" w:line="240" w:lineRule="auto"/>
       </w:pPr>
     </w:p>
     <w:p>
       <w:pPr>
         <w:rPr>
-          <w:rFonts w:ascii="Times New Roman" w:hAnsi="Times New Roman" w:cs="Times New Roman"/>
-        </w:rPr>
+          <w:rFonts w:ascii="Times New Roman" w:hAnsi="Times New Roman" w:eastAsia="Times New Roman" w:cs="Times New Roman"/>
+          <w:sz w:val="22"/>
+          <w:szCs w:val="22"/>
+        </w:rPr>
+        <w:spacing w:before="0" w:after="100" w:line="240" w:lineRule="auto"/>
       </w:pPr>
     </w:p>
     <w:p>
       <w:pPr>
         <w:rPr>
-          <w:rFonts w:ascii="Times New Roman" w:hAnsi="Times New Roman" w:cs="Times New Roman"/>
-        </w:rPr>
+          <w:rFonts w:ascii="Times New Roman" w:hAnsi="Times New Roman" w:eastAsia="Times New Roman" w:cs="Times New Roman"/>
+          <w:sz w:val="22"/>
+          <w:szCs w:val="22"/>
+        </w:rPr>
+        <w:spacing w:before="0" w:after="100" w:line="240" w:lineRule="auto"/>
       </w:pPr>
     </w:p>
     <w:tbl>
@@ -923,16 +1147,21 @@
             <w:pPr>
               <w:jc w:val="center"/>
               <w:rPr>
-                <w:rFonts w:ascii="Times New Roman" w:hAnsi="Times New Roman" w:cs="Times New Roman"/>
+                <w:rFonts w:ascii="Times New Roman" w:hAnsi="Times New Roman" w:eastAsia="Times New Roman" w:cs="Times New Roman"/>
                 <w:b/>
                 <w:bCs/>
-              </w:rPr>
+                <w:sz w:val="22"/>
+                <w:szCs w:val="22"/>
+              </w:rPr>
+              <w:spacing w:before="0" w:after="100" w:line="240" w:lineRule="auto"/>
             </w:pPr>
             <w:r>
               <w:rPr>
-                <w:rFonts w:ascii="Times New Roman" w:hAnsi="Times New Roman" w:cs="Times New Roman"/>
+                <w:rFonts w:ascii="Times New Roman" w:hAnsi="Times New Roman" w:eastAsia="Times New Roman" w:cs="Times New Roman"/>
                 <w:b/>
                 <w:bCs/>
+                <w:sz w:val="22"/>
+                <w:szCs w:val="22"/>
               </w:rPr>
               <w:t xml:space="preserve">Mentor </w:t>
             </w:r>
@@ -941,34 +1170,45 @@
             <w:pPr>
               <w:jc w:val="center"/>
               <w:rPr>
-                <w:rFonts w:ascii="Times New Roman" w:hAnsi="Times New Roman" w:cs="Times New Roman"/>
-              </w:rPr>
+                <w:rFonts w:ascii="Times New Roman" w:hAnsi="Times New Roman" w:eastAsia="Times New Roman" w:cs="Times New Roman"/>
+                <w:sz w:val="22"/>
+                <w:szCs w:val="22"/>
+              </w:rPr>
+              <w:spacing w:before="0" w:after="100" w:line="240" w:lineRule="auto"/>
             </w:pPr>
             <w:r>
               <w:rPr>
-                <w:rFonts w:ascii="Times New Roman" w:hAnsi="Times New Roman" w:cs="Times New Roman"/>
+                <w:rFonts w:ascii="Times New Roman" w:hAnsi="Times New Roman" w:eastAsia="Times New Roman" w:cs="Times New Roman"/>
                 <w:b/>
                 <w:bCs/>
+                <w:sz w:val="22"/>
+                <w:szCs w:val="22"/>
               </w:rPr>
               <w:t>DEB</w:t>
             </w:r>
             <w:r>
               <w:rPr>
-                <w:rFonts w:ascii="Times New Roman" w:hAnsi="Times New Roman" w:cs="Times New Roman"/>
+                <w:rFonts w:ascii="Times New Roman" w:hAnsi="Times New Roman" w:eastAsia="Times New Roman" w:cs="Times New Roman"/>
                 <w:b/>
                 <w:bCs/>
+                <w:sz w:val="22"/>
+                <w:szCs w:val="22"/>
               </w:rPr>
               <w:t xml:space="preserve"> Sobat Bumi</w:t>
             </w:r>
             <w:r>
               <w:rPr>
-                <w:rFonts w:ascii="Times New Roman" w:hAnsi="Times New Roman" w:cs="Times New Roman"/>
+                <w:rFonts w:ascii="Times New Roman" w:hAnsi="Times New Roman" w:eastAsia="Times New Roman" w:cs="Times New Roman"/>
+                <w:sz w:val="22"/>
+                <w:szCs w:val="22"/>
               </w:rPr>
               <w:br/>
             </w:r>
             <w:r>
               <w:rPr>
-                <w:rFonts w:ascii="Times New Roman" w:hAnsi="Times New Roman" w:cs="Times New Roman"/>
+                <w:rFonts w:ascii="Times New Roman" w:hAnsi="Times New Roman" w:eastAsia="Times New Roman" w:cs="Times New Roman"/>
+                <w:sz w:val="22"/>
+                <w:szCs w:val="22"/>
               </w:rPr>
               <w:t xml:space="preserve">{namaPerguruanTinggi}</w:t>
             </w:r>
@@ -979,20 +1219,28 @@
             <w:pPr>
               <w:jc w:val="center"/>
               <w:rPr>
-                <w:rFonts w:ascii="Times New Roman" w:hAnsi="Times New Roman" w:cs="Times New Roman"/>
-              </w:rPr>
+                <w:rFonts w:ascii="Times New Roman" w:hAnsi="Times New Roman" w:eastAsia="Times New Roman" w:cs="Times New Roman"/>
+                <w:sz w:val="22"/>
+                <w:szCs w:val="22"/>
+              </w:rPr>
+              <w:spacing w:before="0" w:after="100" w:line="240" w:lineRule="auto"/>
             </w:pPr>
           </w:p>
           <w:p>
             <w:pPr>
               <w:ind w:left="520"/>
               <w:rPr>
-                <w:rFonts w:ascii="Times New Roman" w:hAnsi="Times New Roman" w:cs="Times New Roman"/>
-              </w:rPr>
+                <w:rFonts w:ascii="Times New Roman" w:hAnsi="Times New Roman" w:eastAsia="Times New Roman" w:cs="Times New Roman"/>
+                <w:sz w:val="22"/>
+                <w:szCs w:val="22"/>
+              </w:rPr>
+              <w:spacing w:before="0" w:after="100" w:line="240" w:lineRule="auto"/>
             </w:pPr>
             <w:r>
               <w:rPr>
-                <w:rFonts w:ascii="Times New Roman" w:hAnsi="Times New Roman" w:cs="Times New Roman"/>
+                <w:rFonts w:ascii="Times New Roman" w:hAnsi="Times New Roman" w:eastAsia="Times New Roman" w:cs="Times New Roman"/>
+                <w:sz w:val="22"/>
+                <w:szCs w:val="22"/>
               </w:rPr>
               <w:t>(Meterai)</w:t>
             </w:r>
@@ -1000,28 +1248,39 @@
           <w:p>
             <w:pPr>
               <w:rPr>
-                <w:rFonts w:ascii="Times New Roman" w:hAnsi="Times New Roman" w:cs="Times New Roman"/>
-              </w:rPr>
+                <w:rFonts w:ascii="Times New Roman" w:hAnsi="Times New Roman" w:eastAsia="Times New Roman" w:cs="Times New Roman"/>
+                <w:sz w:val="22"/>
+                <w:szCs w:val="22"/>
+              </w:rPr>
+              <w:spacing w:before="0" w:after="100" w:line="240" w:lineRule="auto"/>
             </w:pPr>
           </w:p>
           <w:p>
             <w:pPr>
               <w:jc w:val="center"/>
               <w:rPr>
-                <w:rFonts w:ascii="Times New Roman" w:hAnsi="Times New Roman" w:cs="Times New Roman"/>
-              </w:rPr>
+                <w:rFonts w:ascii="Times New Roman" w:hAnsi="Times New Roman" w:eastAsia="Times New Roman" w:cs="Times New Roman"/>
+                <w:sz w:val="22"/>
+                <w:szCs w:val="22"/>
+              </w:rPr>
+              <w:spacing w:before="0" w:after="100" w:line="240" w:lineRule="auto"/>
             </w:pPr>
           </w:p>
           <w:p>
             <w:pPr>
               <w:jc w:val="center"/>
               <w:rPr>
-                <w:rFonts w:ascii="Times New Roman" w:hAnsi="Times New Roman" w:cs="Times New Roman"/>
-              </w:rPr>
+                <w:rFonts w:ascii="Times New Roman" w:hAnsi="Times New Roman" w:eastAsia="Times New Roman" w:cs="Times New Roman"/>
+                <w:sz w:val="22"/>
+                <w:szCs w:val="22"/>
+              </w:rPr>
+              <w:spacing w:before="0" w:after="100" w:line="240" w:lineRule="auto"/>
             </w:pPr>
             <w:r>
               <w:rPr>
-                <w:rFonts w:ascii="Times New Roman" w:hAnsi="Times New Roman" w:cs="Times New Roman"/>
+                <w:rFonts w:ascii="Times New Roman" w:hAnsi="Times New Roman" w:eastAsia="Times New Roman" w:cs="Times New Roman"/>
+                <w:sz w:val="22"/>
+                <w:szCs w:val="22"/>
               </w:rPr>
               <w:t xml:space="preserve">{namaMentor}</w:t>
             </w:r>
@@ -1035,16 +1294,21 @@
             <w:pPr>
               <w:jc w:val="center"/>
               <w:rPr>
-                <w:rFonts w:ascii="Times New Roman" w:hAnsi="Times New Roman" w:cs="Times New Roman"/>
+                <w:rFonts w:ascii="Times New Roman" w:hAnsi="Times New Roman" w:eastAsia="Times New Roman" w:cs="Times New Roman"/>
                 <w:b/>
                 <w:bCs/>
-              </w:rPr>
+                <w:sz w:val="22"/>
+                <w:szCs w:val="22"/>
+              </w:rPr>
+              <w:spacing w:before="0" w:after="100" w:line="240" w:lineRule="auto"/>
             </w:pPr>
             <w:r>
               <w:rPr>
-                <w:rFonts w:ascii="Times New Roman" w:hAnsi="Times New Roman" w:cs="Times New Roman"/>
+                <w:rFonts w:ascii="Times New Roman" w:hAnsi="Times New Roman" w:eastAsia="Times New Roman" w:cs="Times New Roman"/>
                 <w:b/>
                 <w:bCs/>
+                <w:sz w:val="22"/>
+                <w:szCs w:val="22"/>
               </w:rPr>
               <w:t>Koordinator</w:t>
             </w:r>
@@ -1053,32 +1317,41 @@
             <w:pPr>
               <w:jc w:val="center"/>
               <w:rPr>
-                <w:rFonts w:ascii="Times New Roman" w:hAnsi="Times New Roman" w:cs="Times New Roman"/>
+                <w:rFonts w:ascii="Times New Roman" w:hAnsi="Times New Roman" w:eastAsia="Times New Roman" w:cs="Times New Roman"/>
                 <w:b/>
                 <w:bCs/>
-              </w:rPr>
+                <w:sz w:val="22"/>
+                <w:szCs w:val="22"/>
+              </w:rPr>
+              <w:spacing w:before="0" w:after="100" w:line="240" w:lineRule="auto"/>
             </w:pPr>
             <w:r>
               <w:rPr>
-                <w:rFonts w:ascii="Times New Roman" w:hAnsi="Times New Roman" w:cs="Times New Roman"/>
+                <w:rFonts w:ascii="Times New Roman" w:hAnsi="Times New Roman" w:eastAsia="Times New Roman" w:cs="Times New Roman"/>
                 <w:b/>
                 <w:bCs/>
+                <w:sz w:val="22"/>
+                <w:szCs w:val="22"/>
               </w:rPr>
               <w:t xml:space="preserve">DEB Sobat Bumi </w:t>
             </w:r>
             <w:r>
               <w:rPr>
-                <w:rFonts w:ascii="Times New Roman" w:hAnsi="Times New Roman" w:cs="Times New Roman"/>
+                <w:rFonts w:ascii="Times New Roman" w:hAnsi="Times New Roman" w:eastAsia="Times New Roman" w:cs="Times New Roman"/>
                 <w:b/>
                 <w:bCs/>
+                <w:sz w:val="22"/>
+                <w:szCs w:val="22"/>
               </w:rPr>
               <w:t>202</w:t>
             </w:r>
             <w:r>
               <w:rPr>
-                <w:rFonts w:ascii="Times New Roman" w:hAnsi="Times New Roman" w:cs="Times New Roman"/>
+                <w:rFonts w:ascii="Times New Roman" w:hAnsi="Times New Roman" w:eastAsia="Times New Roman" w:cs="Times New Roman"/>
                 <w:b/>
                 <w:bCs/>
+                <w:sz w:val="22"/>
+                <w:szCs w:val="22"/>
               </w:rPr>
               <w:t>5/2026</w:t>
             </w:r>
@@ -1087,12 +1360,17 @@
             <w:pPr>
               <w:jc w:val="center"/>
               <w:rPr>
-                <w:rFonts w:ascii="Times New Roman" w:hAnsi="Times New Roman" w:cs="Times New Roman"/>
-              </w:rPr>
+                <w:rFonts w:ascii="Times New Roman" w:hAnsi="Times New Roman" w:eastAsia="Times New Roman" w:cs="Times New Roman"/>
+                <w:sz w:val="22"/>
+                <w:szCs w:val="22"/>
+              </w:rPr>
+              <w:spacing w:before="0" w:after="100" w:line="240" w:lineRule="auto"/>
             </w:pPr>
             <w:r>
               <w:rPr>
-                <w:rFonts w:ascii="Times New Roman" w:hAnsi="Times New Roman" w:cs="Times New Roman"/>
+                <w:rFonts w:ascii="Times New Roman" w:hAnsi="Times New Roman" w:eastAsia="Times New Roman" w:cs="Times New Roman"/>
+                <w:sz w:val="22"/>
+                <w:szCs w:val="22"/>
               </w:rPr>
               <w:t xml:space="preserve">{namaPerguruanTinggi}</w:t>
             </w:r>
@@ -1102,42 +1380,58 @@
           <w:p>
             <w:pPr>
               <w:rPr>
-                <w:rFonts w:ascii="Times New Roman" w:hAnsi="Times New Roman" w:cs="Times New Roman"/>
-              </w:rPr>
+                <w:rFonts w:ascii="Times New Roman" w:hAnsi="Times New Roman" w:eastAsia="Times New Roman" w:cs="Times New Roman"/>
+                <w:sz w:val="22"/>
+                <w:szCs w:val="22"/>
+              </w:rPr>
+              <w:spacing w:before="0" w:after="100" w:line="240" w:lineRule="auto"/>
             </w:pPr>
           </w:p>
           <w:p>
             <w:pPr>
               <w:rPr>
-                <w:rFonts w:ascii="Times New Roman" w:hAnsi="Times New Roman" w:cs="Times New Roman"/>
-              </w:rPr>
+                <w:rFonts w:ascii="Times New Roman" w:hAnsi="Times New Roman" w:eastAsia="Times New Roman" w:cs="Times New Roman"/>
+                <w:sz w:val="22"/>
+                <w:szCs w:val="22"/>
+              </w:rPr>
+              <w:spacing w:before="0" w:after="100" w:line="240" w:lineRule="auto"/>
             </w:pPr>
           </w:p>
           <w:p>
             <w:pPr>
               <w:rPr>
-                <w:rFonts w:ascii="Times New Roman" w:hAnsi="Times New Roman" w:cs="Times New Roman"/>
-              </w:rPr>
+                <w:rFonts w:ascii="Times New Roman" w:hAnsi="Times New Roman" w:eastAsia="Times New Roman" w:cs="Times New Roman"/>
+                <w:sz w:val="22"/>
+                <w:szCs w:val="22"/>
+              </w:rPr>
+              <w:spacing w:before="0" w:after="100" w:line="240" w:lineRule="auto"/>
             </w:pPr>
           </w:p>
           <w:p>
             <w:pPr>
               <w:rPr>
-                <w:rFonts w:ascii="Times New Roman" w:hAnsi="Times New Roman" w:cs="Times New Roman"/>
-              </w:rPr>
+                <w:rFonts w:ascii="Times New Roman" w:hAnsi="Times New Roman" w:eastAsia="Times New Roman" w:cs="Times New Roman"/>
+                <w:sz w:val="22"/>
+                <w:szCs w:val="22"/>
+              </w:rPr>
+              <w:spacing w:before="0" w:after="100" w:line="240" w:lineRule="auto"/>
             </w:pPr>
           </w:p>
           <w:p>
             <w:pPr>
               <w:jc w:val="center"/>
               <w:rPr>
-                <w:rFonts w:ascii="Times New Roman" w:hAnsi="Times New Roman" w:cs="Times New Roman"/>
-                <w:highlight w:val="yellow"/>
-              </w:rPr>
+                <w:rFonts w:ascii="Times New Roman" w:hAnsi="Times New Roman" w:eastAsia="Times New Roman" w:cs="Times New Roman"/>
+                <w:sz w:val="22"/>
+                <w:szCs w:val="22"/>
+              </w:rPr>
+              <w:spacing w:before="0" w:after="100" w:line="240" w:lineRule="auto"/>
             </w:pPr>
             <w:r>
               <w:rPr>
-                <w:rFonts w:ascii="Times New Roman" w:hAnsi="Times New Roman" w:cs="Times New Roman"/>
+                <w:rFonts w:ascii="Times New Roman" w:hAnsi="Times New Roman" w:eastAsia="Times New Roman" w:cs="Times New Roman"/>
+                <w:sz w:val="22"/>
+                <w:szCs w:val="22"/>
               </w:rPr>
               <w:t xml:space="preserve">{namaKoordinator}</w:t>
             </w:r>
@@ -1201,6 +1495,12 @@
           <w:pPr>
             <w:pStyle w:val="Header"/>
             <w:ind w:left="-115"/>
+            <w:rPr>
+              <w:rFonts w:ascii="Times New Roman" w:hAnsi="Times New Roman" w:eastAsia="Times New Roman" w:cs="Times New Roman"/>
+              <w:sz w:val="22"/>
+              <w:szCs w:val="22"/>
+            </w:rPr>
+            <w:spacing w:before="0" w:after="100" w:line="240" w:lineRule="auto"/>
           </w:pPr>
         </w:p>
       </w:tc>
@@ -1212,6 +1512,12 @@
           <w:pPr>
             <w:pStyle w:val="Header"/>
             <w:jc w:val="center"/>
+            <w:rPr>
+              <w:rFonts w:ascii="Times New Roman" w:hAnsi="Times New Roman" w:eastAsia="Times New Roman" w:cs="Times New Roman"/>
+              <w:sz w:val="22"/>
+              <w:szCs w:val="22"/>
+            </w:rPr>
+            <w:spacing w:before="0" w:after="100" w:line="240" w:lineRule="auto"/>
           </w:pPr>
         </w:p>
       </w:tc>
@@ -1224,6 +1530,12 @@
             <w:pStyle w:val="Header"/>
             <w:ind w:right="-115"/>
             <w:jc w:val="right"/>
+            <w:rPr>
+              <w:rFonts w:ascii="Times New Roman" w:hAnsi="Times New Roman" w:eastAsia="Times New Roman" w:cs="Times New Roman"/>
+              <w:sz w:val="22"/>
+              <w:szCs w:val="22"/>
+            </w:rPr>
+            <w:spacing w:before="0" w:after="100" w:line="240" w:lineRule="auto"/>
           </w:pPr>
         </w:p>
       </w:tc>
@@ -1232,6 +1544,12 @@
   <w:p>
     <w:pPr>
       <w:pStyle w:val="Footer"/>
+      <w:rPr>
+        <w:rFonts w:ascii="Times New Roman" w:hAnsi="Times New Roman" w:eastAsia="Times New Roman" w:cs="Times New Roman"/>
+        <w:sz w:val="22"/>
+        <w:szCs w:val="22"/>
+      </w:rPr>
+      <w:spacing w:before="0" w:after="100" w:line="240" w:lineRule="auto"/>
     </w:pPr>
   </w:p>
 </w:ftr>
@@ -1264,158 +1582,38 @@
       <w:ind w:left="360"/>
       <w:jc w:val="right"/>
       <w:rPr>
-        <w:rFonts w:asciiTheme="majorHAnsi" w:eastAsiaTheme="majorEastAsia" w:hAnsiTheme="majorHAnsi" w:cstheme="majorBidi"/>
-        <w:sz w:val="44"/>
-        <w:szCs w:val="44"/>
+        <w:rFonts w:ascii="Times New Roman" w:hAnsi="Times New Roman" w:eastAsia="Times New Roman" w:cs="Times New Roman"/>
+        <w:sz w:val="22"/>
+        <w:szCs w:val="22"/>
       </w:rPr>
+      <w:spacing w:before="0" w:after="100" w:line="240" w:lineRule="auto"/>
     </w:pPr>
     <w:r>
       <w:rPr>
-        <w:rFonts w:asciiTheme="majorHAnsi" w:eastAsiaTheme="majorEastAsia" w:hAnsiTheme="majorHAnsi" w:cstheme="majorBidi"/>
-        <w:sz w:val="44"/>
-        <w:szCs w:val="44"/>
+        <w:rFonts w:ascii="Times New Roman" w:hAnsi="Times New Roman" w:eastAsia="Times New Roman" w:cs="Times New Roman"/>
+        <w:sz w:val="22"/>
+        <w:szCs w:val="22"/>
       </w:rPr>
       <w:t>INVOIS</w:t>
     </w:r>
     <w:r>
       <w:rPr>
         <w:noProof/>
+        <w:rFonts w:ascii="Times New Roman" w:hAnsi="Times New Roman" w:eastAsia="Times New Roman" w:cs="Times New Roman"/>
+        <w:sz w:val="22"/>
+        <w:szCs w:val="22"/>
       </w:rPr>
-      <mc:AlternateContent>
-        <mc:Choice Requires="wps">
-          <w:drawing>
-            <wp:anchor distT="0" distB="0" distL="114300" distR="114300" simplePos="0" relativeHeight="251660288" behindDoc="0" locked="0" layoutInCell="1" allowOverlap="1" wp14:anchorId="095BF9E4" wp14:editId="0DE89177">
-              <wp:simplePos x="0" y="0"/>
-              <wp:positionH relativeFrom="column">
-                <wp:posOffset>-79514</wp:posOffset>
-              </wp:positionH>
-              <wp:positionV relativeFrom="paragraph">
-                <wp:posOffset>-107674</wp:posOffset>
-              </wp:positionV>
-              <wp:extent cx="4320000" cy="540000"/>
-              <wp:effectExtent l="0" t="0" r="28575" b="18415"/>
-              <wp:wrapNone/>
-              <wp:docPr id="126831539" name="Text Box 2"/>
-              <wp:cNvGraphicFramePr/>
-              <a:graphic xmlns:a="http://schemas.openxmlformats.org/drawingml/2006/main">
-                <a:graphicData uri="http://schemas.microsoft.com/office/word/2010/wordprocessingShape">
-                  <wps:wsp>
-                    <wps:cNvSpPr txBox="1"/>
-                    <wps:spPr>
-                      <a:xfrm>
-                        <a:off x="0" y="0"/>
-                        <a:ext cx="4320000" cy="540000"/>
-                      </a:xfrm>
-                      <a:prstGeom prst="rect">
-                        <a:avLst/>
-                      </a:prstGeom>
-                      <a:solidFill>
-                        <a:schemeClr val="lt1"/>
-                      </a:solidFill>
-                      <a:ln w="6350">
-                        <a:solidFill>
-                          <a:prstClr val="black"/>
-                        </a:solidFill>
-                      </a:ln>
-                    </wps:spPr>
-                    <wps:txbx>
-                      <w:txbxContent>
-                        <w:p>
-                          <w:pPr>
-                            <w:jc w:val="center"/>
-                            <w:rPr>
-                              <w:b/>
-                              <w:bCs/>
-                              <w:sz w:val="20"/>
-                              <w:szCs w:val="20"/>
-                            </w:rPr>
-                          </w:pPr>
-                          <w:r>
-                            <w:rPr>
-                              <w:b/>
-                              <w:bCs/>
-                              <w:sz w:val="20"/>
-                              <w:szCs w:val="20"/>
-                            </w:rPr>
-                            <w:t xml:space="preserve">{namaPerguruanTinggiKapital}</w:t>
-                            <w:br/>
-                          </w:r>
-                          <w:r>
-                            <w:rPr>
-                              <w:sz w:val="18"/>
-                              <w:szCs w:val="18"/>
-                            </w:rPr>
-                            <w:t xml:space="preserve">{alamatPerguruanTinggi}</w:t>
-                          </w:r>
-                        </w:p>
-                      </w:txbxContent>
-                    </wps:txbx>
-                    <wps:bodyPr rot="0" spcFirstLastPara="0" vertOverflow="overflow" horzOverflow="overflow" vert="horz" wrap="square" lIns="91440" tIns="45720" rIns="91440" bIns="45720" numCol="1" spcCol="0" rtlCol="0" fromWordArt="0" anchor="t" anchorCtr="0" forceAA="0" compatLnSpc="1">
-                      <a:prstTxWarp prst="textNoShape">
-                        <a:avLst/>
-                      </a:prstTxWarp>
-                      <a:noAutofit/>
-                    </wps:bodyPr>
-                  </wps:wsp>
-                </a:graphicData>
-              </a:graphic>
-              <wp14:sizeRelH relativeFrom="margin">
-                <wp14:pctWidth>0</wp14:pctWidth>
-              </wp14:sizeRelH>
-              <wp14:sizeRelV relativeFrom="margin">
-                <wp14:pctHeight>0</wp14:pctHeight>
-              </wp14:sizeRelV>
-            </wp:anchor>
-          </w:drawing>
-        </mc:Choice>
-        <mc:Fallback xmlns:a="http://schemas.openxmlformats.org/drawingml/2006/main">
-          <w:pict w14:anchorId="44047108">
-            <v:shapetype id="_x0000_t202" coordsize="21600,21600" o:spt="202" path="m,l,21600r21600,l21600,xe" w14:anchorId="095BF9E4">
-              <v:stroke joinstyle="miter"/>
-              <v:path gradientshapeok="t" o:connecttype="rect"/>
-            </v:shapetype>
-            <v:shape id="Text Box 2" style="position:absolute;margin-left:-6.25pt;margin-top:-8.5pt;width:340.2pt;height:42.5pt;z-index:251660288;visibility:visible;mso-wrap-style:square;mso-width-percent:0;mso-height-percent:0;mso-wrap-distance-left:9pt;mso-wrap-distance-top:0;mso-wrap-distance-right:9pt;mso-wrap-distance-bottom:0;mso-position-horizontal:absolute;mso-position-horizontal-relative:text;mso-position-vertical:absolute;mso-position-vertical-relative:text;mso-width-percent:0;mso-height-percent:0;mso-width-relative:margin;mso-height-relative:margin;v-text-anchor:top" o:spid="_x0000_s1026" fillcolor="white [3201]" strokeweight=".5pt" type="#_x0000_t202" o:gfxdata="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">
-              <v:textbox>
-                <w:txbxContent>
-                  <w:p>
-                    <w:pPr>
-                      <w:jc w:val="center"/>
-                      <w:rPr>
-                        <w:b/>
-                        <w:bCs/>
-                        <w:sz w:val="20"/>
-                        <w:szCs w:val="20"/>
-                      </w:rPr>
-                    </w:pPr>
-                    <w:r>
-                      <w:rPr>
-                        <w:b/>
-                        <w:bCs/>
-                        <w:sz w:val="20"/>
-                        <w:szCs w:val="20"/>
-                      </w:rPr>
-                      <w:t xml:space="preserve">{namaPerguruanTinggiKapital}</w:t>
-                      <w:br/>
-                    </w:r>
-                    <w:r>
-                      <w:rPr>
-                        <w:sz w:val="18"/>
-                        <w:szCs w:val="18"/>
-                      </w:rPr>
-                      <w:t xml:space="preserve">{alamatPerguruanTinggi}</w:t>
-                    </w:r>
-                  </w:p>
-                </w:txbxContent>
-              </v:textbox>
-            </v:shape>
-          </w:pict>
-        </mc:Fallback>
-      </mc:AlternateContent>
     </w:r>
   </w:p>
   <w:p>
     <w:pPr>
       <w:pStyle w:val="Header"/>
+      <w:rPr>
+        <w:rFonts w:ascii="Times New Roman" w:hAnsi="Times New Roman" w:eastAsia="Times New Roman" w:cs="Times New Roman"/>
+        <w:sz w:val="22"/>
+        <w:szCs w:val="22"/>
+      </w:rPr>
+      <w:spacing w:before="0" w:after="100" w:line="240" w:lineRule="auto"/>
     </w:pPr>
   </w:p>
 </w:hdr>
@@ -1523,7 +1721,7 @@
   <w:docDefaults>
     <w:rPrDefault>
       <w:rPr>
-        <w:rFonts w:asciiTheme="minorHAnsi" w:eastAsia="Arial MT" w:hAnsiTheme="minorHAnsi" w:cstheme="minorBidi"/>
+        <w:rFonts w:ascii="Times New Roman" w:hAnsi="Times New Roman" w:eastAsia="Times New Roman" w:cs="Times New Roman"/>
         <w:sz w:val="22"/>
         <w:szCs w:val="22"/>
         <w:lang w:val="en-ID" w:eastAsia="en-US" w:bidi="ar-SA"/>
@@ -1920,8 +2118,10 @@
     <w:qFormat/>
     <w:rsid w:val="00646079"/>
     <w:rPr>
-      <w:rFonts w:ascii="Arial MT" w:hAnsi="Arial MT" w:cs="Arial MT"/>
+      <w:rFonts w:ascii="Times New Roman" w:hAnsi="Times New Roman" w:eastAsia="Times New Roman" w:cs="Times New Roman"/>
       <w:lang w:val="ms"/>
+      <w:sz w:val="22"/>
+      <w:szCs w:val="22"/>
     </w:rPr>
   </w:style>
   <w:style w:type="paragraph" w:styleId="Heading1">
@@ -1938,9 +2138,11 @@
       <w:outlineLvl w:val="0"/>
     </w:pPr>
     <w:rPr>
-      <w:rFonts w:ascii="Arial" w:eastAsia="Arial" w:hAnsi="Arial" w:cs="Arial"/>
+      <w:rFonts w:ascii="Times New Roman" w:hAnsi="Times New Roman" w:eastAsia="Times New Roman" w:cs="Times New Roman"/>
       <w:b/>
       <w:bCs/>
+      <w:sz w:val="22"/>
+      <w:szCs w:val="22"/>
     </w:rPr>
   </w:style>
   <w:style w:type="character" w:default="1" w:styleId="DefaultParagraphFont">
@@ -1984,10 +2186,12 @@
     <w:uiPriority w:val="9"/>
     <w:rsid w:val="00AC5830"/>
     <w:rPr>
-      <w:rFonts w:ascii="Arial" w:eastAsia="Arial" w:hAnsi="Arial" w:cs="Arial"/>
+      <w:rFonts w:ascii="Times New Roman" w:hAnsi="Times New Roman" w:eastAsia="Times New Roman" w:cs="Times New Roman"/>
       <w:b/>
       <w:bCs/>
       <w:lang w:val="ms"/>
+      <w:sz w:val="22"/>
+      <w:szCs w:val="22"/>
     </w:rPr>
   </w:style>
   <w:style w:type="paragraph" w:styleId="Title">
@@ -2003,11 +2207,11 @@
       <w:jc w:val="center"/>
     </w:pPr>
     <w:rPr>
-      <w:rFonts w:ascii="Arial" w:eastAsia="Arial" w:hAnsi="Arial" w:cs="Arial"/>
+      <w:rFonts w:ascii="Times New Roman" w:hAnsi="Times New Roman" w:eastAsia="Times New Roman" w:cs="Times New Roman"/>
       <w:b/>
       <w:bCs/>
-      <w:sz w:val="32"/>
-      <w:szCs w:val="32"/>
+      <w:sz w:val="22"/>
+      <w:szCs w:val="22"/>
     </w:rPr>
   </w:style>
   <w:style w:type="character" w:customStyle="1" w:styleId="TitleChar">
@@ -2017,11 +2221,11 @@
     <w:uiPriority w:val="10"/>
     <w:rsid w:val="00AC5830"/>
     <w:rPr>
-      <w:rFonts w:ascii="Arial" w:eastAsia="Arial" w:hAnsi="Arial" w:cs="Arial"/>
+      <w:rFonts w:ascii="Times New Roman" w:hAnsi="Times New Roman" w:eastAsia="Times New Roman" w:cs="Times New Roman"/>
       <w:b/>
       <w:bCs/>
-      <w:sz w:val="32"/>
-      <w:szCs w:val="32"/>
+      <w:sz w:val="22"/>
+      <w:szCs w:val="22"/>
       <w:lang w:val="ms"/>
     </w:rPr>
   </w:style>
@@ -2040,8 +2244,10 @@
     <w:uiPriority w:val="1"/>
     <w:rsid w:val="00AC5830"/>
     <w:rPr>
-      <w:rFonts w:ascii="Arial MT" w:eastAsia="Arial MT" w:hAnsi="Arial MT" w:cs="Arial MT"/>
+      <w:rFonts w:ascii="Times New Roman" w:hAnsi="Times New Roman" w:eastAsia="Times New Roman" w:cs="Times New Roman"/>
       <w:lang w:val="ms"/>
+      <w:sz w:val="22"/>
+      <w:szCs w:val="22"/>
     </w:rPr>
   </w:style>
   <w:style w:type="paragraph" w:styleId="ListParagraph">
@@ -2076,8 +2282,10 @@
     <w:uiPriority w:val="99"/>
     <w:rsid w:val="00FA2499"/>
     <w:rPr>
-      <w:rFonts w:ascii="Arial MT" w:hAnsi="Arial MT" w:cs="Arial MT"/>
+      <w:rFonts w:ascii="Times New Roman" w:hAnsi="Times New Roman" w:eastAsia="Times New Roman" w:cs="Times New Roman"/>
       <w:lang w:val="ms"/>
+      <w:sz w:val="22"/>
+      <w:szCs w:val="22"/>
     </w:rPr>
   </w:style>
   <w:style w:type="paragraph" w:styleId="Footer">
@@ -2101,8 +2309,10 @@
     <w:uiPriority w:val="99"/>
     <w:rsid w:val="00FA2499"/>
     <w:rPr>
-      <w:rFonts w:ascii="Arial MT" w:hAnsi="Arial MT" w:cs="Arial MT"/>
+      <w:rFonts w:ascii="Times New Roman" w:hAnsi="Times New Roman" w:eastAsia="Times New Roman" w:cs="Times New Roman"/>
       <w:lang w:val="ms"/>
+      <w:sz w:val="22"/>
+      <w:szCs w:val="22"/>
     </w:rPr>
   </w:style>
   <w:style w:type="table" w:styleId="TableGrid">

</xml_diff>